<commit_message>
Rename the game to Fish On! and remove the voice line
Logo, titles, package/app names (FishOn.AppImage, fish-on launcher) and
docs now say Fish On!. The synthetic "Fish on!" voice, its credit and
tools are removed; music and sound effects are unchanged.
</commit_message>
<xml_diff>
--- a/docs/dev-log/word/2026-10-07_session-02.docx
+++ b/docs/dev-log/word/2026-10-07_session-02.docx
@@ -192,6 +192,98 @@
           <w:b/>
           <w:bCs/>
         </w:rPr>
+        <w:t xml:space="preserve">Renamed the game "Fish On!"</w:t>
+      </w:r>
+      <w:r>
+        <w:t xml:space="preserve"> </w:t>
+      </w:r>
+      <w:r>
+        <w:t xml:space="preserve">(was working title "Specimen Hunter"). Spec moved to</w:t>
+      </w:r>
+      <w:r>
+        <w:t xml:space="preserve"> </w:t>
+      </w:r>
+      <w:r>
+        <w:rPr>
+          <w:rStyle w:val="VerbatimChar"/>
+        </w:rPr>
+        <w:t xml:space="preserve">docs/spec/fish-on-spec.md</w:t>
+      </w:r>
+      <w:r>
+        <w:t xml:space="preserve">; the simulator keeps its file name</w:t>
+      </w:r>
+      <w:r>
+        <w:t xml:space="preserve"> </w:t>
+      </w:r>
+      <w:r>
+        <w:rPr>
+          <w:rStyle w:val="VerbatimChar"/>
+        </w:rPr>
+        <w:t xml:space="preserve">math/specimen_hunter_sim.py</w:t>
+      </w:r>
+      <w:r>
+        <w:t xml:space="preserve">. Trademark check now needed on "Fish On!" (a common angling phrase, so check for existing slot/game titles).</w:t>
+      </w:r>
+    </w:p>
+    <w:p>
+      <w:pPr>
+        <w:pStyle w:val="Compact"/>
+        <w:numPr>
+          <w:ilvl w:val="0"/>
+          <w:numId w:val="1001"/>
+        </w:numPr>
+      </w:pPr>
+      <w:r>
+        <w:rPr>
+          <w:b/>
+          <w:bCs/>
+        </w:rPr>
+        <w:t xml:space="preserve">Later additions:</w:t>
+      </w:r>
+      <w:r>
+        <w:t xml:space="preserve"> </w:t>
+      </w:r>
+      <w:r>
+        <w:t xml:space="preserve">desktop app (Electron,</w:t>
+      </w:r>
+      <w:r>
+        <w:t xml:space="preserve"> </w:t>
+      </w:r>
+      <w:r>
+        <w:rPr>
+          <w:rStyle w:val="VerbatimChar"/>
+        </w:rPr>
+        <w:t xml:space="preserve">desktop/</w:t>
+      </w:r>
+      <w:r>
+        <w:t xml:space="preserve">, builds</w:t>
+      </w:r>
+      <w:r>
+        <w:t xml:space="preserve"> </w:t>
+      </w:r>
+      <w:r>
+        <w:rPr>
+          <w:rStyle w:val="VerbatimChar"/>
+        </w:rPr>
+        <w:t xml:space="preserve">FishOn.AppImage</w:t>
+      </w:r>
+      <w:r>
+        <w:t xml:space="preserve">), generated background music (calm base, livelier free spins, ♫/N toggle), big-win count-up now plays before the feature summary. A synthetic "Fish on!" voice line was tried and then removed.</w:t>
+      </w:r>
+    </w:p>
+    <w:p>
+      <w:pPr>
+        <w:pStyle w:val="Compact"/>
+        <w:numPr>
+          <w:ilvl w:val="0"/>
+          <w:numId w:val="1001"/>
+        </w:numPr>
+      </w:pPr>
+      <w:r>
+        <w:rPr>
+          <w:b/>
+          <w:bCs/>
+        </w:rPr>
         <w:t xml:space="preserve">Advertised max win still undecided.</w:t>
       </w:r>
       <w:r>
@@ -647,7 +739,7 @@
         </w:numPr>
       </w:pPr>
       <w:r>
-        <w:t xml:space="preserve">Trademark check on "Specimen Hunter"; patent check on the collect mechanic</w:t>
+        <w:t xml:space="preserve">Trademark check on "Fish On!"; patent check on the collect mechanic</w:t>
       </w:r>
     </w:p>
     <w:p>

</xml_diff>

<commit_message>
Rename simulator to fish_on_sim.py and fix leftover old-name references
Also corrects the desktop package-lock name and a dev-log link to the
old spec path. Historical dev-log entries keep the old working title.
</commit_message>
<xml_diff>
--- a/docs/dev-log/word/2026-10-07_session-02.docx
+++ b/docs/dev-log/word/2026-10-07_session-02.docx
@@ -198,7 +198,7 @@
         <w:t xml:space="preserve"> </w:t>
       </w:r>
       <w:r>
-        <w:t xml:space="preserve">(was working title "Specimen Hunter"). Spec moved to</w:t>
+        <w:t xml:space="preserve">(was working title "Specimen Hunter"). Files renamed to match: spec is now</w:t>
       </w:r>
       <w:r>
         <w:t xml:space="preserve"> </w:t>
@@ -210,19 +210,49 @@
         <w:t xml:space="preserve">docs/spec/fish-on-spec.md</w:t>
       </w:r>
       <w:r>
-        <w:t xml:space="preserve">; the simulator keeps its file name</w:t>
-      </w:r>
-      <w:r>
-        <w:t xml:space="preserve"> </w:t>
-      </w:r>
-      <w:r>
-        <w:rPr>
-          <w:rStyle w:val="VerbatimChar"/>
-        </w:rPr>
-        <w:t xml:space="preserve">math/specimen_hunter_sim.py</w:t>
-      </w:r>
-      <w:r>
-        <w:t xml:space="preserve">. Trademark check now needed on "Fish On!" (a common angling phrase, so check for existing slot/game titles).</w:t>
+        <w:t xml:space="preserve">, simulator is now</w:t>
+      </w:r>
+      <w:r>
+        <w:t xml:space="preserve"> </w:t>
+      </w:r>
+      <w:r>
+        <w:rPr>
+          <w:rStyle w:val="VerbatimChar"/>
+        </w:rPr>
+        <w:t xml:space="preserve">math/fish_on_sim.py</w:t>
+      </w:r>
+      <w:r>
+        <w:t xml:space="preserve"> </w:t>
+      </w:r>
+      <w:r>
+        <w:t xml:space="preserve">(run</w:t>
+      </w:r>
+      <w:r>
+        <w:t xml:space="preserve"> </w:t>
+      </w:r>
+      <w:r>
+        <w:rPr>
+          <w:rStyle w:val="VerbatimChar"/>
+        </w:rPr>
+        <w:t xml:space="preserve">python fish_on_sim.py ...</w:t>
+      </w:r>
+      <w:r>
+        <w:t xml:space="preserve"> </w:t>
+      </w:r>
+      <w:r>
+        <w:t xml:space="preserve">instead of</w:t>
+      </w:r>
+      <w:r>
+        <w:t xml:space="preserve"> </w:t>
+      </w:r>
+      <w:r>
+        <w:rPr>
+          <w:rStyle w:val="VerbatimChar"/>
+        </w:rPr>
+        <w:t xml:space="preserve">specimen_hunter_sim.py</w:t>
+      </w:r>
+      <w:r>
+        <w:t xml:space="preserve">). Trademark check now needed on "Fish On!" (a common angling phrase, so check for existing slot/game titles).</w:t>
       </w:r>
     </w:p>
     <w:p>
@@ -462,7 +492,7 @@
         <w:rPr>
           <w:rStyle w:val="VerbatimChar"/>
         </w:rPr>
-        <w:t xml:space="preserve">docs/spec/specimen-hunter-spec.md</w:t>
+        <w:t xml:space="preserve">docs/spec/fish-on-spec.md</w:t>
       </w:r>
       <w:r>
         <w:t xml:space="preserve"> </w:t>

</xml_diff>

<commit_message>
Rename back to Specimen Hunter
"FISH ON!" is a registered US trademark of King Show Games for slot
machines and game software (see docs/legal). Game, desktop app, server,
PAR sheet, spec and simulator file names are Specimen Hunter again.
</commit_message>
<xml_diff>
--- a/docs/dev-log/word/2026-10-07_session-02.docx
+++ b/docs/dev-log/word/2026-10-07_session-02.docx
@@ -268,37 +268,46 @@
           <w:b/>
           <w:bCs/>
         </w:rPr>
-        <w:t xml:space="preserve">Later additions:</w:t>
-      </w:r>
-      <w:r>
-        <w:t xml:space="preserve"> </w:t>
-      </w:r>
-      <w:r>
-        <w:t xml:space="preserve">desktop app (Electron,</w:t>
-      </w:r>
-      <w:r>
-        <w:t xml:space="preserve"> </w:t>
-      </w:r>
-      <w:r>
-        <w:rPr>
-          <w:rStyle w:val="VerbatimChar"/>
-        </w:rPr>
-        <w:t xml:space="preserve">desktop/</w:t>
-      </w:r>
-      <w:r>
-        <w:t xml:space="preserve">, builds</w:t>
-      </w:r>
-      <w:r>
-        <w:t xml:space="preserve"> </w:t>
-      </w:r>
-      <w:r>
-        <w:rPr>
-          <w:rStyle w:val="VerbatimChar"/>
-        </w:rPr>
-        <w:t xml:space="preserve">FishOn.AppImage</w:t>
-      </w:r>
-      <w:r>
-        <w:t xml:space="preserve">), generated background music (calm base, livelier free spins, ♫/N toggle), big-win count-up now plays before the feature summary. A synthetic "Fish on!" voice line was tried and then removed.</w:t>
+        <w:t xml:space="preserve">Renamed back to "Specimen Hunter"</w:t>
+      </w:r>
+      <w:r>
+        <w:t xml:space="preserve"> </w:t>
+      </w:r>
+      <w:r>
+        <w:t xml:space="preserve">the same day: "FISH ON!" turned out to be a registered US trademark of King Show Games (a slot maker) for slot machines and game software. Files renamed back (</w:t>
+      </w:r>
+      <w:r>
+        <w:rPr>
+          <w:rStyle w:val="VerbatimChar"/>
+        </w:rPr>
+        <w:t xml:space="preserve">math/specimen_hunter_sim.py</w:t>
+      </w:r>
+      <w:r>
+        <w:t xml:space="preserve">,</w:t>
+      </w:r>
+      <w:r>
+        <w:t xml:space="preserve"> </w:t>
+      </w:r>
+      <w:r>
+        <w:rPr>
+          <w:rStyle w:val="VerbatimChar"/>
+        </w:rPr>
+        <w:t xml:space="preserve">docs/spec/specimen-hunter-spec.md</w:t>
+      </w:r>
+      <w:r>
+        <w:t xml:space="preserve">). See</w:t>
+      </w:r>
+      <w:r>
+        <w:t xml:space="preserve"> </w:t>
+      </w:r>
+      <w:r>
+        <w:rPr>
+          <w:rStyle w:val="VerbatimChar"/>
+        </w:rPr>
+        <w:t xml:space="preserve">docs/legal/ip-and-regulatory-check.md</w:t>
+      </w:r>
+      <w:r>
+        <w:t xml:space="preserve">.</w:t>
       </w:r>
     </w:p>
     <w:p>
@@ -314,6 +323,52 @@
           <w:b/>
           <w:bCs/>
         </w:rPr>
+        <w:t xml:space="preserve">Later additions:</w:t>
+      </w:r>
+      <w:r>
+        <w:t xml:space="preserve"> </w:t>
+      </w:r>
+      <w:r>
+        <w:t xml:space="preserve">desktop app (Electron,</w:t>
+      </w:r>
+      <w:r>
+        <w:t xml:space="preserve"> </w:t>
+      </w:r>
+      <w:r>
+        <w:rPr>
+          <w:rStyle w:val="VerbatimChar"/>
+        </w:rPr>
+        <w:t xml:space="preserve">desktop/</w:t>
+      </w:r>
+      <w:r>
+        <w:t xml:space="preserve">, builds</w:t>
+      </w:r>
+      <w:r>
+        <w:t xml:space="preserve"> </w:t>
+      </w:r>
+      <w:r>
+        <w:rPr>
+          <w:rStyle w:val="VerbatimChar"/>
+        </w:rPr>
+        <w:t xml:space="preserve">SpecimenHunter.AppImage</w:t>
+      </w:r>
+      <w:r>
+        <w:t xml:space="preserve">), generated background music (calm base, livelier free spins, ♫/N toggle), big-win count-up now plays before the feature summary. A synthetic "Fish on!" voice line was tried and then removed.</w:t>
+      </w:r>
+    </w:p>
+    <w:p>
+      <w:pPr>
+        <w:pStyle w:val="Compact"/>
+        <w:numPr>
+          <w:ilvl w:val="0"/>
+          <w:numId w:val="1001"/>
+        </w:numPr>
+      </w:pPr>
+      <w:r>
+        <w:rPr>
+          <w:b/>
+          <w:bCs/>
+        </w:rPr>
         <w:t xml:space="preserve">Advertised max win still undecided.</w:t>
       </w:r>
       <w:r>
@@ -492,7 +547,7 @@
         <w:rPr>
           <w:rStyle w:val="VerbatimChar"/>
         </w:rPr>
-        <w:t xml:space="preserve">docs/spec/fish-on-spec.md</w:t>
+        <w:t xml:space="preserve">docs/spec/specimen-hunter-spec.md</w:t>
       </w:r>
       <w:r>
         <w:t xml:space="preserve"> </w:t>
@@ -769,7 +824,7 @@
         </w:numPr>
       </w:pPr>
       <w:r>
-        <w:t xml:space="preserve">Trademark check on "Fish On!"; patent check on the collect mechanic</w:t>
+        <w:t xml:space="preserve">UK IPO / EUIPO trade mark check on "Specimen Hunter" (US register clear); patent freedom-to-operate on the cash-fish mechanic</w:t>
       </w:r>
     </w:p>
     <w:p>

</xml_diff>